<commit_message>
Update portfolio resume files
</commit_message>
<xml_diff>
--- a/assets/hrithik-mishra-resume.docx
+++ b/assets/hrithik-mishra-resume.docx
@@ -54,7 +54,7 @@
         <w:widowControl w:val="0"/>
       </w:pPr>
       <w:r>
-        <w:t>Mobile/software engineer with 4+ years of professional engineering experience building and supporting production Flutter/Dart applications for Android and iOS. Strong in maintainable modular architecture, Clean Architecture, Riverpod/BLoC state management, REST APIs, real-time communication, performance optimization, and mobile release workflows. Broadened into backend, cloud, product ownership, and AI engineering, including LLM-assisted development and LangChain agent guardrails for deterministic, domain-constrained workflows.</w:t>
+        <w:t>Mobile/software engineer with 4+ years of professional engineering experience building and supporting production Flutter/Dart applications for Android and iOS. Experienced in designing maintainable, modular architectures using Clean Architecture and Riverpod/BLoC state management, with hands-on work across REST APIs, real-time communication, performance optimization, and mobile release workflows. Broadened into backend, cloud, product ownership, and AI engineering, including LLM-assisted development and LangChain agent guardrails for deterministic, domain-constrained workflows.</w:t>
       </w:r>
     </w:p>
     <w:p>
@@ -662,7 +662,7 @@
         <w:widowControl w:val="0"/>
       </w:pPr>
       <w:r>
-        <w:t>First Class Distinction; 9.7 GPA in final semester</w:t>
+        <w:t>CGPA: 9.41/10 | Final Semester SGPA: 9.89/10 | First Class Distinction</w:t>
       </w:r>
     </w:p>
     <w:p>

</xml_diff>